<commit_message>
cadangkan penyesuaian bank soal sebelum integrasi monitoring
</commit_message>
<xml_diff>
--- a/public/templates/Template_Import_Bank_Soal_SMK.docx
+++ b/public/templates/Template_Import_Bank_Soal_SMK.docx
@@ -156,7 +156,7 @@
     </w:p>
     <w:p>
       <w:r>
-        <w:t xml:space="preserve">TIPE: Isian</w:t>
+        <w:t xml:space="preserve">TIPE: Esai</w:t>
       </w:r>
     </w:p>
     <w:p>
@@ -166,12 +166,12 @@
     </w:p>
     <w:p>
       <w:r>
-        <w:t xml:space="preserve">PERTANYAAN: Tulis pertanyaan jawaban singkat di sini.</w:t>
-      </w:r>
-    </w:p>
-    <w:p>
-      <w:r>
-        <w:t xml:space="preserve">KUNCI: Tulis jawaban benar di sini.</w:t>
+        <w:t xml:space="preserve">PERTANYAAN: Tulis pertanyaan esai di sini.</w:t>
+      </w:r>
+    </w:p>
+    <w:p>
+      <w:r>
+        <w:t xml:space="preserve">RUBRIK: Tulis pedoman penilaian dan poin jawaban di sini.</w:t>
       </w:r>
     </w:p>
     <w:p>
@@ -186,7 +186,7 @@
     </w:p>
     <w:p>
       <w:r>
-        <w:t xml:space="preserve">TIPE: Esai</w:t>
+        <w:t xml:space="preserve">TIPE: Interaktif</w:t>
       </w:r>
     </w:p>
     <w:p>
@@ -196,36 +196,6 @@
     </w:p>
     <w:p>
       <w:r>
-        <w:t xml:space="preserve">PERTANYAAN: Tulis pertanyaan esai di sini.</w:t>
-      </w:r>
-    </w:p>
-    <w:p>
-      <w:r>
-        <w:t xml:space="preserve">RUBRIK: Tulis pedoman penilaian dan poin jawaban di sini.</w:t>
-      </w:r>
-    </w:p>
-    <w:p>
-      <w:r>
-        <w:t xml:space="preserve">--- SOAL ---</w:t>
-      </w:r>
-    </w:p>
-    <w:p>
-      <w:r>
-        <w:t xml:space="preserve">NO: 4</w:t>
-      </w:r>
-    </w:p>
-    <w:p>
-      <w:r>
-        <w:t xml:space="preserve">TIPE: Interaktif</w:t>
-      </w:r>
-    </w:p>
-    <w:p>
-      <w:r>
-        <w:t xml:space="preserve">KESULITAN: Sedang</w:t>
-      </w:r>
-    </w:p>
-    <w:p>
-      <w:r>
         <w:t xml:space="preserve">PERTANYAAN: Tulis instruksi setelah siswa melihat atau mendengar media.</w:t>
       </w:r>
     </w:p>
@@ -241,12 +211,37 @@
     </w:p>
     <w:p>
       <w:r>
-        <w:t xml:space="preserve">JENIS_JAWABAN: Isian</w:t>
-      </w:r>
-    </w:p>
-    <w:p>
-      <w:r>
-        <w:t xml:space="preserve">KUNCI: Isi bila jawaban perlu dikunci otomatis.</w:t>
+        <w:t xml:space="preserve">JENIS_JAWABAN: PG</w:t>
+      </w:r>
+    </w:p>
+    <w:p>
+      <w:r>
+        <w:t xml:space="preserve">PILIHAN_A: Tulis pilihan A di sini.</w:t>
+      </w:r>
+    </w:p>
+    <w:p>
+      <w:r>
+        <w:t xml:space="preserve">PILIHAN_B: Tulis pilihan B di sini.</w:t>
+      </w:r>
+    </w:p>
+    <w:p>
+      <w:r>
+        <w:t xml:space="preserve">PILIHAN_C: Tulis pilihan C di sini.</w:t>
+      </w:r>
+    </w:p>
+    <w:p>
+      <w:r>
+        <w:t xml:space="preserve">PILIHAN_D: Tulis pilihan D di sini.</w:t>
+      </w:r>
+    </w:p>
+    <w:p>
+      <w:r>
+        <w:t xml:space="preserve">PILIHAN_E: Tulis pilihan E di sini.</w:t>
+      </w:r>
+    </w:p>
+    <w:p>
+      <w:r>
+        <w:t xml:space="preserve">KUNCI: A</w:t>
       </w:r>
     </w:p>
     <w:p>

</xml_diff>